<commit_message>
Polish report spacing and diagrams
</commit_message>
<xml_diff>
--- a/rapport-i-fall-complet.docx
+++ b/rapport-i-fall-complet.docx
@@ -724,7 +724,7 @@
           </w:p>
           <w:p>
             <w:pPr>
-              <w:spacing w:before="0" w:after="0" w:line="245" w:lineRule="auto"/>
+              <w:spacing w:before="40" w:after="0" w:line="245" w:lineRule="auto"/>
             </w:pPr>
             <w:r>
               <w:rPr>
@@ -2593,7 +2593,7 @@
           </w:p>
           <w:p>
             <w:pPr>
-              <w:spacing w:before="0" w:after="0" w:line="245" w:lineRule="auto"/>
+              <w:spacing w:before="40" w:after="0" w:line="245" w:lineRule="auto"/>
             </w:pPr>
             <w:r>
               <w:rPr>
@@ -3882,7 +3882,7 @@
           </w:p>
           <w:p>
             <w:pPr>
-              <w:spacing w:before="0" w:after="0" w:line="245" w:lineRule="auto"/>
+              <w:spacing w:before="40" w:after="0" w:line="245" w:lineRule="auto"/>
             </w:pPr>
             <w:r>
               <w:rPr>
@@ -5219,7 +5219,7 @@
           </w:p>
           <w:p>
             <w:pPr>
-              <w:spacing w:before="0" w:after="0" w:line="245" w:lineRule="auto"/>
+              <w:spacing w:before="40" w:after="0" w:line="245" w:lineRule="auto"/>
             </w:pPr>
             <w:r>
               <w:rPr>
@@ -6640,7 +6640,7 @@
           </w:p>
           <w:p>
             <w:pPr>
-              <w:spacing w:before="0" w:after="0" w:line="245" w:lineRule="auto"/>
+              <w:spacing w:before="40" w:after="0" w:line="245" w:lineRule="auto"/>
             </w:pPr>
             <w:r>
               <w:rPr>
@@ -7814,7 +7814,7 @@
           </w:p>
           <w:p>
             <w:pPr>
-              <w:spacing w:before="0" w:after="0" w:line="245" w:lineRule="auto"/>
+              <w:spacing w:before="40" w:after="0" w:line="245" w:lineRule="auto"/>
             </w:pPr>
             <w:r>
               <w:rPr>
@@ -9208,7 +9208,7 @@
           </w:p>
           <w:p>
             <w:pPr>
-              <w:spacing w:before="0" w:after="0" w:line="245" w:lineRule="auto"/>
+              <w:spacing w:before="40" w:after="0" w:line="245" w:lineRule="auto"/>
             </w:pPr>
             <w:r>
               <w:rPr>
@@ -10982,7 +10982,7 @@
           </w:p>
           <w:p>
             <w:pPr>
-              <w:spacing w:before="0" w:after="0" w:line="245" w:lineRule="auto"/>
+              <w:spacing w:before="40" w:after="0" w:line="245" w:lineRule="auto"/>
             </w:pPr>
             <w:r>
               <w:rPr>
@@ -12577,7 +12577,7 @@
           </w:p>
           <w:p>
             <w:pPr>
-              <w:spacing w:before="0" w:after="0" w:line="245" w:lineRule="auto"/>
+              <w:spacing w:before="40" w:after="0" w:line="245" w:lineRule="auto"/>
             </w:pPr>
             <w:r>
               <w:rPr>
@@ -13657,7 +13657,7 @@
           </w:p>
           <w:p>
             <w:pPr>
-              <w:spacing w:before="0" w:after="0" w:line="245" w:lineRule="auto"/>
+              <w:spacing w:before="40" w:after="0" w:line="245" w:lineRule="auto"/>
             </w:pPr>
             <w:r>
               <w:rPr>

</xml_diff>

<commit_message>
Insert ChatUser captures and clean report assets
</commit_message>
<xml_diff>
--- a/rapport-i-fall-complet.docx
+++ b/rapport-i-fall-complet.docx
@@ -12099,7 +12099,7 @@
           <w:color w:val="111827"/>
           <w:sz w:val="21"/>
         </w:rPr>
-        <w:t>Les captures ne doivent pas être placées en rafale. Elles servent à prouver l’exécution et doivent apparaître après une explication du scénario. Les cadres ci-dessous indiquent les captures recommandées lorsque l’application est lancée localement.</w:t>
+        <w:t>Les captures ci-dessous documentent une exécution réelle de la version REST de ChatUser. Elles complètent les schémas en montrant le serveur, les clients, l’échange de messages et la sortie d’un utilisateur.</w:t>
       </w:r>
     </w:p>
     <w:tbl>
@@ -12136,7 +12136,7 @@
           </w:tcPr>
           <w:p>
             <w:pPr>
-              <w:spacing w:before="0" w:after="60" w:line="245" w:lineRule="auto"/>
+              <w:spacing w:before="0" w:after="80" w:line="245" w:lineRule="auto"/>
             </w:pPr>
             <w:r>
               <w:rPr>
@@ -12146,38 +12146,62 @@
                 <w:color w:val="0F7182"/>
                 <w:sz w:val="20"/>
               </w:rPr>
-              <w:t>Capture 1 : serveur ChatUser démarré</w:t>
+              <w:t>Capture 7.1 : serveur REST démarré</w:t>
             </w:r>
           </w:p>
           <w:p>
             <w:pPr>
-              <w:spacing w:before="0" w:after="0" w:line="240" w:lineRule="auto"/>
+              <w:spacing w:before="0" w:after="60" w:line="245" w:lineRule="auto"/>
+              <w:jc w:val="center"/>
+            </w:pPr>
+            <w:r>
+              <w:drawing>
+                <wp:inline xmlns:a="http://schemas.openxmlformats.org/drawingml/2006/main" xmlns:pic="http://schemas.openxmlformats.org/drawingml/2006/picture">
+                  <wp:extent cx="5292000" cy="2975297"/>
+                  <wp:docPr id="9" name="Picture 9"/>
+                  <wp:cNvGraphicFramePr>
+                    <a:graphicFrameLocks noChangeAspect="1"/>
+                  </wp:cNvGraphicFramePr>
+                  <a:graphic>
+                    <a:graphicData uri="http://schemas.openxmlformats.org/drawingml/2006/picture">
+                      <pic:pic>
+                        <pic:nvPicPr>
+                          <pic:cNvPr id="0" name="server-start.png"/>
+                          <pic:cNvPicPr/>
+                        </pic:nvPicPr>
+                        <pic:blipFill>
+                          <a:blip r:embed="rId20"/>
+                          <a:stretch>
+                            <a:fillRect/>
+                          </a:stretch>
+                        </pic:blipFill>
+                        <pic:spPr>
+                          <a:xfrm>
+                            <a:off x="0" y="0"/>
+                            <a:ext cx="5292000" cy="2975297"/>
+                          </a:xfrm>
+                          <a:prstGeom prst="rect"/>
+                        </pic:spPr>
+                      </pic:pic>
+                    </a:graphicData>
+                  </a:graphic>
+                </wp:inline>
+              </w:drawing>
+            </w:r>
+          </w:p>
+          <w:p>
+            <w:pPr>
+              <w:spacing w:before="40" w:after="0" w:line="240" w:lineRule="auto"/>
             </w:pPr>
             <w:r>
               <w:rPr>
                 <w:rFonts w:ascii="Arial" w:hAnsi="Arial" w:eastAsia="Arial"/>
                 <w:b w:val="0"/>
-                <w:i/>
-                <w:color w:val="64748B"/>
-                <w:sz w:val="18"/>
-              </w:rPr>
-              <w:t>Insérer une capture du terminal serveur après `ant run-server`, avec le port visible et le message indiquant que le serveur attend les connexions.</w:t>
-            </w:r>
-          </w:p>
-          <w:p>
-            <w:pPr>
-              <w:spacing w:before="200" w:after="120" w:line="245" w:lineRule="auto"/>
-              <w:jc w:val="center"/>
-            </w:pPr>
-            <w:r>
-              <w:rPr>
-                <w:rFonts w:ascii="Arial" w:hAnsi="Arial" w:eastAsia="Arial"/>
-                <w:b/>
                 <w:i w:val="0"/>
                 <w:color w:val="334155"/>
-                <w:sz w:val="20"/>
+                <w:sz w:val="17"/>
               </w:rPr>
-              <w:t>[ Zone réservée à la capture d’écran ]</w:t>
+              <w:t>Cette capture montre le lancement du serveur avec `ant run-server`. Le terminal affiche le port `8082`, les endpoints REST disponibles et les premières notifications d’arrivée dans la salle.</w:t>
             </w:r>
           </w:p>
         </w:tc>
@@ -12218,7 +12242,7 @@
           </w:tcPr>
           <w:p>
             <w:pPr>
-              <w:spacing w:before="0" w:after="60" w:line="245" w:lineRule="auto"/>
+              <w:spacing w:before="0" w:after="80" w:line="245" w:lineRule="auto"/>
             </w:pPr>
             <w:r>
               <w:rPr>
@@ -12228,38 +12252,62 @@
                 <w:color w:val="0F7182"/>
                 <w:sz w:val="20"/>
               </w:rPr>
-              <w:t>Capture 2 : deux clients connectés</w:t>
+              <w:t>Capture 7.2 : deux clients connectés</w:t>
             </w:r>
           </w:p>
           <w:p>
             <w:pPr>
-              <w:spacing w:before="0" w:after="0" w:line="240" w:lineRule="auto"/>
+              <w:spacing w:before="0" w:after="60" w:line="245" w:lineRule="auto"/>
+              <w:jc w:val="center"/>
+            </w:pPr>
+            <w:r>
+              <w:drawing>
+                <wp:inline xmlns:a="http://schemas.openxmlformats.org/drawingml/2006/main" xmlns:pic="http://schemas.openxmlformats.org/drawingml/2006/picture">
+                  <wp:extent cx="5292000" cy="2975297"/>
+                  <wp:docPr id="10" name="Picture 10"/>
+                  <wp:cNvGraphicFramePr>
+                    <a:graphicFrameLocks noChangeAspect="1"/>
+                  </wp:cNvGraphicFramePr>
+                  <a:graphic>
+                    <a:graphicData uri="http://schemas.openxmlformats.org/drawingml/2006/picture">
+                      <pic:pic>
+                        <pic:nvPicPr>
+                          <pic:cNvPr id="0" name="two-client-connected.png"/>
+                          <pic:cNvPicPr/>
+                        </pic:nvPicPr>
+                        <pic:blipFill>
+                          <a:blip r:embed="rId21"/>
+                          <a:stretch>
+                            <a:fillRect/>
+                          </a:stretch>
+                        </pic:blipFill>
+                        <pic:spPr>
+                          <a:xfrm>
+                            <a:off x="0" y="0"/>
+                            <a:ext cx="5292000" cy="2975297"/>
+                          </a:xfrm>
+                          <a:prstGeom prst="rect"/>
+                        </pic:spPr>
+                      </pic:pic>
+                    </a:graphicData>
+                  </a:graphic>
+                </wp:inline>
+              </w:drawing>
+            </w:r>
+          </w:p>
+          <w:p>
+            <w:pPr>
+              <w:spacing w:before="40" w:after="0" w:line="240" w:lineRule="auto"/>
             </w:pPr>
             <w:r>
               <w:rPr>
                 <w:rFonts w:ascii="Arial" w:hAnsi="Arial" w:eastAsia="Arial"/>
                 <w:b w:val="0"/>
-                <w:i/>
-                <w:color w:val="64748B"/>
-                <w:sz w:val="18"/>
-              </w:rPr>
-              <w:t>Insérer une capture montrant deux fenêtres client avec des pseudos différents, par exemple Alice et Bob.</w:t>
-            </w:r>
-          </w:p>
-          <w:p>
-            <w:pPr>
-              <w:spacing w:before="200" w:after="120" w:line="245" w:lineRule="auto"/>
-              <w:jc w:val="center"/>
-            </w:pPr>
-            <w:r>
-              <w:rPr>
-                <w:rFonts w:ascii="Arial" w:hAnsi="Arial" w:eastAsia="Arial"/>
-                <w:b/>
                 <w:i w:val="0"/>
                 <w:color w:val="334155"/>
-                <w:sz w:val="20"/>
+                <w:sz w:val="17"/>
               </w:rPr>
-              <w:t>[ Zone réservée à la capture d’écran ]</w:t>
+              <w:t>Cette capture confirme que deux utilisateurs distincts rejoignent la salle de discussion. Le serveur reçoit les événements et les affiche dans le terminal.</w:t>
             </w:r>
           </w:p>
         </w:tc>
@@ -12300,7 +12348,7 @@
           </w:tcPr>
           <w:p>
             <w:pPr>
-              <w:spacing w:before="0" w:after="60" w:line="245" w:lineRule="auto"/>
+              <w:spacing w:before="0" w:after="80" w:line="245" w:lineRule="auto"/>
             </w:pPr>
             <w:r>
               <w:rPr>
@@ -12310,38 +12358,62 @@
                 <w:color w:val="0F7182"/>
                 <w:sz w:val="20"/>
               </w:rPr>
-              <w:t>Capture 3 : message envoyé et reçu</w:t>
+              <w:t>Capture 7.3 : message envoyé et reçu</w:t>
             </w:r>
           </w:p>
           <w:p>
             <w:pPr>
-              <w:spacing w:before="0" w:after="0" w:line="240" w:lineRule="auto"/>
+              <w:spacing w:before="0" w:after="60" w:line="245" w:lineRule="auto"/>
+              <w:jc w:val="center"/>
+            </w:pPr>
+            <w:r>
+              <w:drawing>
+                <wp:inline xmlns:a="http://schemas.openxmlformats.org/drawingml/2006/main" xmlns:pic="http://schemas.openxmlformats.org/drawingml/2006/picture">
+                  <wp:extent cx="5292000" cy="2590470"/>
+                  <wp:docPr id="11" name="Picture 11"/>
+                  <wp:cNvGraphicFramePr>
+                    <a:graphicFrameLocks noChangeAspect="1"/>
+                  </wp:cNvGraphicFramePr>
+                  <a:graphic>
+                    <a:graphicData uri="http://schemas.openxmlformats.org/drawingml/2006/picture">
+                      <pic:pic>
+                        <pic:nvPicPr>
+                          <pic:cNvPr id="0" name="send-message.png"/>
+                          <pic:cNvPicPr/>
+                        </pic:nvPicPr>
+                        <pic:blipFill>
+                          <a:blip r:embed="rId22"/>
+                          <a:stretch>
+                            <a:fillRect/>
+                          </a:stretch>
+                        </pic:blipFill>
+                        <pic:spPr>
+                          <a:xfrm>
+                            <a:off x="0" y="0"/>
+                            <a:ext cx="5292000" cy="2590470"/>
+                          </a:xfrm>
+                          <a:prstGeom prst="rect"/>
+                        </pic:spPr>
+                      </pic:pic>
+                    </a:graphicData>
+                  </a:graphic>
+                </wp:inline>
+              </w:drawing>
+            </w:r>
+          </w:p>
+          <w:p>
+            <w:pPr>
+              <w:spacing w:before="40" w:after="0" w:line="240" w:lineRule="auto"/>
             </w:pPr>
             <w:r>
               <w:rPr>
                 <w:rFonts w:ascii="Arial" w:hAnsi="Arial" w:eastAsia="Arial"/>
                 <w:b w:val="0"/>
-                <w:i/>
-                <w:color w:val="64748B"/>
-                <w:sz w:val="18"/>
-              </w:rPr>
-              <w:t>Insérer une capture où un message envoyé par un client apparaît chez l’autre, pour valider la diffusion ou la récupération par polling.</w:t>
-            </w:r>
-          </w:p>
-          <w:p>
-            <w:pPr>
-              <w:spacing w:before="200" w:after="120" w:line="245" w:lineRule="auto"/>
-              <w:jc w:val="center"/>
-            </w:pPr>
-            <w:r>
-              <w:rPr>
-                <w:rFonts w:ascii="Arial" w:hAnsi="Arial" w:eastAsia="Arial"/>
-                <w:b/>
                 <w:i w:val="0"/>
                 <w:color w:val="334155"/>
-                <w:sz w:val="20"/>
+                <w:sz w:val="17"/>
               </w:rPr>
-              <w:t>[ Zone réservée à la capture d’écran ]</w:t>
+              <w:t>Cette capture montre deux fenêtres clientes. Un message envoyé par un utilisateur apparaît dans l’autre fenêtre, ce qui valide la circulation des messages entre clients via le serveur REST.</w:t>
             </w:r>
           </w:p>
         </w:tc>
@@ -12382,7 +12454,7 @@
           </w:tcPr>
           <w:p>
             <w:pPr>
-              <w:spacing w:before="0" w:after="60" w:line="245" w:lineRule="auto"/>
+              <w:spacing w:before="0" w:after="80" w:line="245" w:lineRule="auto"/>
             </w:pPr>
             <w:r>
               <w:rPr>
@@ -12392,38 +12464,62 @@
                 <w:color w:val="0F7182"/>
                 <w:sz w:val="20"/>
               </w:rPr>
-              <w:t>Capture 4 : sortie d’un utilisateur</w:t>
+              <w:t>Capture 7.4 : sortie de l’utilisateur Babacar</w:t>
             </w:r>
           </w:p>
           <w:p>
             <w:pPr>
-              <w:spacing w:before="0" w:after="0" w:line="240" w:lineRule="auto"/>
+              <w:spacing w:before="0" w:after="60" w:line="245" w:lineRule="auto"/>
+              <w:jc w:val="center"/>
+            </w:pPr>
+            <w:r>
+              <w:drawing>
+                <wp:inline xmlns:a="http://schemas.openxmlformats.org/drawingml/2006/main" xmlns:pic="http://schemas.openxmlformats.org/drawingml/2006/picture">
+                  <wp:extent cx="5292000" cy="2578154"/>
+                  <wp:docPr id="12" name="Picture 12"/>
+                  <wp:cNvGraphicFramePr>
+                    <a:graphicFrameLocks noChangeAspect="1"/>
+                  </wp:cNvGraphicFramePr>
+                  <a:graphic>
+                    <a:graphicData uri="http://schemas.openxmlformats.org/drawingml/2006/picture">
+                      <pic:pic>
+                        <pic:nvPicPr>
+                          <pic:cNvPr id="0" name="sortie-babacar.png"/>
+                          <pic:cNvPicPr/>
+                        </pic:nvPicPr>
+                        <pic:blipFill>
+                          <a:blip r:embed="rId23"/>
+                          <a:stretch>
+                            <a:fillRect/>
+                          </a:stretch>
+                        </pic:blipFill>
+                        <pic:spPr>
+                          <a:xfrm>
+                            <a:off x="0" y="0"/>
+                            <a:ext cx="5292000" cy="2578154"/>
+                          </a:xfrm>
+                          <a:prstGeom prst="rect"/>
+                        </pic:spPr>
+                      </pic:pic>
+                    </a:graphicData>
+                  </a:graphic>
+                </wp:inline>
+              </w:drawing>
+            </w:r>
+          </w:p>
+          <w:p>
+            <w:pPr>
+              <w:spacing w:before="40" w:after="0" w:line="240" w:lineRule="auto"/>
             </w:pPr>
             <w:r>
               <w:rPr>
                 <w:rFonts w:ascii="Arial" w:hAnsi="Arial" w:eastAsia="Arial"/>
                 <w:b w:val="0"/>
-                <w:i/>
-                <w:color w:val="64748B"/>
-                <w:sz w:val="18"/>
-              </w:rPr>
-              <w:t>Insérer une capture montrant la notification de départ ou l’absence d’erreur serveur après fermeture d’un client.</w:t>
-            </w:r>
-          </w:p>
-          <w:p>
-            <w:pPr>
-              <w:spacing w:before="200" w:after="120" w:line="245" w:lineRule="auto"/>
-              <w:jc w:val="center"/>
-            </w:pPr>
-            <w:r>
-              <w:rPr>
-                <w:rFonts w:ascii="Arial" w:hAnsi="Arial" w:eastAsia="Arial"/>
-                <w:b/>
                 <w:i w:val="0"/>
                 <w:color w:val="334155"/>
-                <w:sz w:val="20"/>
+                <w:sz w:val="17"/>
               </w:rPr>
-              <w:t>[ Zone réservée à la capture d’écran ]</w:t>
+              <w:t>Cette capture illustre la notification de sortie d’un utilisateur. Elle permet de vérifier que la désinscription est prise en compte sans bloquer l’application.</w:t>
             </w:r>
           </w:p>
         </w:tc>
@@ -12642,7 +12738,7 @@
         <w:drawing>
           <wp:inline xmlns:a="http://schemas.openxmlformats.org/drawingml/2006/main" xmlns:pic="http://schemas.openxmlformats.org/drawingml/2006/picture">
             <wp:extent cx="5328000" cy="2699520"/>
-            <wp:docPr id="9" name="Picture 9"/>
+            <wp:docPr id="13" name="Picture 13"/>
             <wp:cNvGraphicFramePr>
               <a:graphicFrameLocks noChangeAspect="1"/>
             </wp:cNvGraphicFramePr>
@@ -12654,7 +12750,7 @@
                     <pic:cNvPicPr/>
                   </pic:nvPicPr>
                   <pic:blipFill>
-                    <a:blip r:embed="rId20"/>
+                    <a:blip r:embed="rId24"/>
                     <a:stretch>
                       <a:fillRect/>
                     </a:stretch>
@@ -13722,7 +13818,7 @@
         <w:drawing>
           <wp:inline xmlns:a="http://schemas.openxmlformats.org/drawingml/2006/main" xmlns:pic="http://schemas.openxmlformats.org/drawingml/2006/picture">
             <wp:extent cx="5328000" cy="2699520"/>
-            <wp:docPr id="10" name="Picture 10"/>
+            <wp:docPr id="14" name="Picture 14"/>
             <wp:cNvGraphicFramePr>
               <a:graphicFrameLocks noChangeAspect="1"/>
             </wp:cNvGraphicFramePr>
@@ -13734,7 +13830,7 @@
                     <pic:cNvPicPr/>
                   </pic:nvPicPr>
                   <pic:blipFill>
-                    <a:blip r:embed="rId21"/>
+                    <a:blip r:embed="rId25"/>
                     <a:stretch>
                       <a:fillRect/>
                     </a:stretch>
@@ -14850,7 +14946,7 @@
         <w:drawing>
           <wp:inline xmlns:a="http://schemas.openxmlformats.org/drawingml/2006/main" xmlns:pic="http://schemas.openxmlformats.org/drawingml/2006/picture">
             <wp:extent cx="5328000" cy="2699520"/>
-            <wp:docPr id="11" name="Picture 11"/>
+            <wp:docPr id="15" name="Picture 15"/>
             <wp:cNvGraphicFramePr>
               <a:graphicFrameLocks noChangeAspect="1"/>
             </wp:cNvGraphicFramePr>
@@ -14862,7 +14958,7 @@
                     <pic:cNvPicPr/>
                   </pic:nvPicPr>
                   <pic:blipFill>
-                    <a:blip r:embed="rId22"/>
+                    <a:blip r:embed="rId26"/>
                     <a:stretch>
                       <a:fillRect/>
                     </a:stretch>

</xml_diff>